<commit_message>
Improve CV page use and readability
</commit_message>
<xml_diff>
--- a/Applications/Nir_Shvarchberg_CV_Microsoft_Product_Manager_II_Education.docx
+++ b/Applications/Nir_Shvarchberg_CV_Microsoft_Product_Manager_II_Education.docx
@@ -4,26 +4,29 @@
   <w:body>
     <w:p>
       <w:pPr>
+        <w:spacing w:after="14" w:line="240" w:lineRule="auto"/>
         <w:jc w:val="center"/>
       </w:pPr>
       <w:r>
         <w:rPr>
           <w:b/>
           <w:color w:val="1F4E79"/>
-          <w:sz w:val="35"/>
+          <w:sz w:val="37"/>
+          <w:szCs w:val="37"/>
         </w:rPr>
         <w:t>NIR SHVARCHBERG</w:t>
       </w:r>
     </w:p>
     <w:p>
       <w:pPr>
-        <w:spacing w:after="9"/>
+        <w:spacing w:after="18" w:line="240" w:lineRule="auto"/>
         <w:jc w:val="center"/>
       </w:pPr>
       <w:r>
         <w:rPr>
           <w:color w:val="5F5F5F"/>
           <w:sz w:val="18"/>
+          <w:szCs w:val="18"/>
         </w:rPr>
         <w:t xml:space="preserve">Tel Aviv-Yafo, Israel | 055-689-5816 | nir1shv@gmail.com | </w:t>
       </w:r>
@@ -33,6 +36,7 @@
             <w:color w:val="1F4E79"/>
             <w:sz w:val="18"/>
             <w:u w:val="single"/>
+            <w:szCs w:val="18"/>
           </w:rPr>
           <w:t>LinkedIn</w:t>
         </w:r>
@@ -40,14 +44,15 @@
     </w:p>
     <w:p>
       <w:pPr>
-        <w:spacing w:after="19"/>
+        <w:spacing w:after="28" w:line="240" w:lineRule="auto"/>
         <w:jc w:val="center"/>
       </w:pPr>
       <w:r>
         <w:rPr>
           <w:b/>
           <w:color w:val="1F4E79"/>
-          <w:sz w:val="19"/>
+          <w:sz w:val="20"/>
+          <w:szCs w:val="20"/>
         </w:rPr>
         <w:t>PRODUCT MANAGER | B2B2C, WEB EXPERIENCES &amp; AI-ASSISTED DELIVERY</w:t>
       </w:r>
@@ -58,7 +63,7 @@
         <w:pBdr>
           <w:bottom w:val="single" w:sz="6" w:space="1" w:color="1F4E79"/>
         </w:pBdr>
-        <w:spacing w:before="49" w:after="31"/>
+        <w:spacing w:before="64" w:after="40" w:line="240" w:lineRule="auto"/>
         <w:rPr>
           <w:sz w:val="20"/>
           <w:szCs w:val="20"/>
@@ -68,15 +73,15 @@
         <w:rPr>
           <w:b/>
           <w:color w:val="1F4E79"/>
-          <w:sz w:val="20"/>
-          <w:szCs w:val="20"/>
+          <w:sz w:val="22"/>
+          <w:szCs w:val="22"/>
         </w:rPr>
         <w:t>PROFESSIONAL SUMMARY</w:t>
       </w:r>
     </w:p>
     <w:p>
       <w:pPr>
-        <w:spacing w:after="24" w:line="250" w:lineRule="auto"/>
+        <w:spacing w:after="40" w:line="238" w:lineRule="exact"/>
         <w:rPr>
           <w:sz w:val="20"/>
           <w:szCs w:val="20"/>
@@ -85,8 +90,8 @@
       <w:r>
         <w:rPr>
           <w:color w:val="000000"/>
-          <w:sz w:val="20"/>
-          <w:szCs w:val="20"/>
+          <w:sz w:val="21"/>
+          <w:szCs w:val="21"/>
         </w:rPr>
         <w:t>Product Manager with 5+ years of experience across B2B SaaS, B2C, and B2B2C digital products, interactive web and mobile journeys, API integrations, user flows, analytics, and end-to-end delivery. At CallApp, owns strategy and roadmap for onboarding, verification, activation, subscriptions, payments, and business-profile experiences, translating ambiguous needs into clear specifications, UX flows, edge cases, and shipped capabilities. Combines customer-facing product work, global-market execution, technical fluency, and hands-on use of AI tools for discovery, requirements, UX exploration, prototypes, and feasibility validation.</w:t>
       </w:r>
@@ -97,7 +102,7 @@
         <w:pBdr>
           <w:bottom w:val="single" w:sz="6" w:space="1" w:color="1F4E79"/>
         </w:pBdr>
-        <w:spacing w:before="49" w:after="31"/>
+        <w:spacing w:before="64" w:after="40" w:line="240" w:lineRule="auto"/>
         <w:rPr>
           <w:sz w:val="20"/>
           <w:szCs w:val="20"/>
@@ -107,8 +112,8 @@
         <w:rPr>
           <w:b/>
           <w:color w:val="1F4E79"/>
-          <w:sz w:val="20"/>
-          <w:szCs w:val="20"/>
+          <w:sz w:val="22"/>
+          <w:szCs w:val="22"/>
         </w:rPr>
         <w:t>PROFESSIONAL EXPERIENCE</w:t>
       </w:r>
@@ -116,7 +121,7 @@
     <w:p>
       <w:pPr>
         <w:keepNext/>
-        <w:spacing w:before="29" w:after="9"/>
+        <w:spacing w:before="44" w:after="16" w:line="240" w:lineRule="auto"/>
         <w:rPr>
           <w:sz w:val="20"/>
           <w:szCs w:val="20"/>
@@ -126,8 +131,8 @@
         <w:rPr>
           <w:b/>
           <w:color w:val="1F4E79"/>
-          <w:sz w:val="20"/>
-          <w:szCs w:val="20"/>
+          <w:sz w:val="21"/>
+          <w:szCs w:val="21"/>
         </w:rPr>
         <w:t>CallApp</w:t>
       </w:r>
@@ -135,8 +140,8 @@
         <w:rPr>
           <w:b/>
           <w:color w:val="1E1E1E"/>
-          <w:sz w:val="20"/>
-          <w:szCs w:val="20"/>
+          <w:sz w:val="21"/>
+          <w:szCs w:val="21"/>
         </w:rPr>
         <w:t xml:space="preserve"> | Product Manager, Branded &amp; Verified Caller </w:t>
       </w:r>
@@ -144,8 +149,8 @@
         <w:rPr>
           <w:b/>
           <w:color w:val="1E1E1E"/>
-          <w:sz w:val="20"/>
-          <w:szCs w:val="20"/>
+          <w:sz w:val="21"/>
+          <w:szCs w:val="21"/>
         </w:rPr>
         <w:t>Identity</w:t>
       </w:r>
@@ -153,8 +158,8 @@
         <w:rPr>
           <w:b/>
           <w:color w:val="5F5F5F"/>
-          <w:sz w:val="20"/>
-          <w:szCs w:val="20"/>
+          <w:sz w:val="21"/>
+          <w:szCs w:val="21"/>
         </w:rPr>
         <w:t xml:space="preserve"> | March</w:t>
       </w:r>
@@ -162,19 +167,20 @@
         <w:rPr>
           <w:b/>
           <w:color w:val="5F5F5F"/>
-          <w:sz w:val="20"/>
-          <w:szCs w:val="20"/>
+          <w:sz w:val="21"/>
+          <w:szCs w:val="21"/>
         </w:rPr>
         <w:t xml:space="preserve"> 2023 - Present</w:t>
       </w:r>
     </w:p>
     <w:p>
       <w:pPr>
+        <w:keepLines/>
         <w:numPr>
           <w:ilvl w:val="0"/>
           <w:numId w:val="1"/>
         </w:numPr>
-        <w:spacing w:after="25" w:line="258" w:lineRule="auto"/>
+        <w:spacing w:after="38" w:line="240" w:lineRule="exact"/>
         <w:rPr>
           <w:sz w:val="20"/>
           <w:szCs w:val="20"/>
@@ -183,19 +189,20 @@
       <w:r>
         <w:rPr>
           <w:color w:val="000000"/>
-          <w:sz w:val="20"/>
-          <w:szCs w:val="20"/>
+          <w:sz w:val="21"/>
+          <w:szCs w:val="21"/>
         </w:rPr>
         <w:t>Own product strategy, roadmap, prioritization, and end-to-end delivery for a B2B SaaS product serving businesses and their end users across web and mobile-oriented experiences.</w:t>
       </w:r>
     </w:p>
     <w:p>
       <w:pPr>
+        <w:keepLines/>
         <w:numPr>
           <w:ilvl w:val="0"/>
           <w:numId w:val="1"/>
         </w:numPr>
-        <w:spacing w:after="25" w:line="258" w:lineRule="auto"/>
+        <w:spacing w:after="38" w:line="240" w:lineRule="exact"/>
         <w:rPr>
           <w:sz w:val="20"/>
           <w:szCs w:val="20"/>
@@ -204,19 +211,20 @@
       <w:r>
         <w:rPr>
           <w:color w:val="000000"/>
-          <w:sz w:val="20"/>
-          <w:szCs w:val="20"/>
+          <w:sz w:val="21"/>
+          <w:szCs w:val="21"/>
         </w:rPr>
         <w:t>Translate customer, business, Support, Sales, and operational needs into PRDs, specifications, business rules, user stories, UX flows, acceptance criteria, edge cases, and actionable priorities.</w:t>
       </w:r>
     </w:p>
     <w:p>
       <w:pPr>
+        <w:keepLines/>
         <w:numPr>
           <w:ilvl w:val="0"/>
           <w:numId w:val="1"/>
         </w:numPr>
-        <w:spacing w:after="25" w:line="258" w:lineRule="auto"/>
+        <w:spacing w:after="38" w:line="240" w:lineRule="exact"/>
         <w:rPr>
           <w:sz w:val="20"/>
           <w:szCs w:val="20"/>
@@ -225,19 +233,20 @@
       <w:r>
         <w:rPr>
           <w:color w:val="000000"/>
-          <w:sz w:val="20"/>
-          <w:szCs w:val="20"/>
+          <w:sz w:val="21"/>
+          <w:szCs w:val="21"/>
         </w:rPr>
         <w:t>Lead interactive user journeys across onboarding, verification, activation, subscriptions, payments, analytics, and business-profile management from discovery through launch and iteration.</w:t>
       </w:r>
     </w:p>
     <w:p>
       <w:pPr>
+        <w:keepLines/>
         <w:numPr>
           <w:ilvl w:val="0"/>
           <w:numId w:val="1"/>
         </w:numPr>
-        <w:spacing w:after="25" w:line="258" w:lineRule="auto"/>
+        <w:spacing w:after="38" w:line="240" w:lineRule="exact"/>
         <w:rPr>
           <w:sz w:val="20"/>
           <w:szCs w:val="20"/>
@@ -246,19 +255,20 @@
       <w:r>
         <w:rPr>
           <w:color w:val="000000"/>
-          <w:sz w:val="20"/>
-          <w:szCs w:val="20"/>
+          <w:sz w:val="21"/>
+          <w:szCs w:val="21"/>
         </w:rPr>
         <w:t>Partner with Engineering, UX, QA, Data, Marketing, Support, Sales, Operations, senior stakeholders, and external vendors to move initiatives from concept through delivery and measurable outcomes.</w:t>
       </w:r>
     </w:p>
     <w:p>
       <w:pPr>
+        <w:keepLines/>
         <w:numPr>
           <w:ilvl w:val="0"/>
           <w:numId w:val="1"/>
         </w:numPr>
-        <w:spacing w:after="25" w:line="258" w:lineRule="auto"/>
+        <w:spacing w:after="38" w:line="240" w:lineRule="exact"/>
         <w:rPr>
           <w:sz w:val="20"/>
           <w:szCs w:val="20"/>
@@ -267,19 +277,20 @@
       <w:r>
         <w:rPr>
           <w:color w:val="000000"/>
-          <w:sz w:val="20"/>
-          <w:szCs w:val="20"/>
+          <w:sz w:val="21"/>
+          <w:szCs w:val="21"/>
         </w:rPr>
         <w:t>Use GA4 and Firebase funnels, support signals, defects, market research, and operational insights to identify friction; mobile traffic share increased from 10% to 60% following mobile UX and campaign-flow changes.</w:t>
       </w:r>
     </w:p>
     <w:p>
       <w:pPr>
+        <w:keepLines/>
         <w:numPr>
           <w:ilvl w:val="0"/>
           <w:numId w:val="1"/>
         </w:numPr>
-        <w:spacing w:after="25" w:line="258" w:lineRule="auto"/>
+        <w:spacing w:after="38" w:line="240" w:lineRule="exact"/>
         <w:rPr>
           <w:sz w:val="20"/>
           <w:szCs w:val="20"/>
@@ -288,16 +299,37 @@
       <w:r>
         <w:rPr>
           <w:color w:val="000000"/>
-          <w:sz w:val="20"/>
-          <w:szCs w:val="20"/>
+          <w:sz w:val="21"/>
+          <w:szCs w:val="21"/>
         </w:rPr>
         <w:t>Use Cursor, Claude, ChatGPT, and Codex for discovery, research, requirements, UX exploration, working prototypes, documentation, and technical feasibility validation.</w:t>
       </w:r>
     </w:p>
     <w:p>
       <w:pPr>
+        <w:keepLines/>
+        <w:numPr>
+          <w:ilvl w:val="0"/>
+          <w:numId w:val="1"/>
+        </w:numPr>
+        <w:spacing w:after="38" w:line="240" w:lineRule="exact"/>
+        <w:rPr>
+          <w:sz w:val="20"/>
+          <w:szCs w:val="20"/>
+        </w:rPr>
+      </w:pPr>
+      <w:r>
+        <w:rPr>
+          <w:sz w:val="21"/>
+          <w:szCs w:val="21"/>
+        </w:rPr>
+        <w:t>Supported product launches and market adaptations across Latin America, Spain, and Africa, coordinating product, operational, and customer-facing requirements for global execution.</w:t>
+      </w:r>
+    </w:p>
+    <w:p>
+      <w:pPr>
         <w:keepNext/>
-        <w:spacing w:before="29" w:after="9"/>
+        <w:spacing w:before="44" w:after="16" w:line="240" w:lineRule="auto"/>
         <w:rPr>
           <w:sz w:val="20"/>
           <w:szCs w:val="20"/>
@@ -307,8 +339,8 @@
         <w:rPr>
           <w:b/>
           <w:color w:val="1F4E79"/>
-          <w:sz w:val="20"/>
-          <w:szCs w:val="20"/>
+          <w:sz w:val="21"/>
+          <w:szCs w:val="21"/>
         </w:rPr>
         <w:t>Tapuhi</w:t>
       </w:r>
@@ -316,8 +348,8 @@
         <w:rPr>
           <w:b/>
           <w:color w:val="1E1E1E"/>
-          <w:sz w:val="20"/>
-          <w:szCs w:val="20"/>
+          <w:sz w:val="21"/>
+          <w:szCs w:val="21"/>
         </w:rPr>
         <w:t xml:space="preserve"> | Founder, Product &amp; Operations </w:t>
       </w:r>
@@ -325,8 +357,8 @@
         <w:rPr>
           <w:b/>
           <w:color w:val="1E1E1E"/>
-          <w:sz w:val="20"/>
-          <w:szCs w:val="20"/>
+          <w:sz w:val="21"/>
+          <w:szCs w:val="21"/>
         </w:rPr>
         <w:t>Manager</w:t>
       </w:r>
@@ -334,8 +366,8 @@
         <w:rPr>
           <w:b/>
           <w:color w:val="5F5F5F"/>
-          <w:sz w:val="20"/>
-          <w:szCs w:val="20"/>
+          <w:sz w:val="21"/>
+          <w:szCs w:val="21"/>
         </w:rPr>
         <w:t xml:space="preserve"> | January</w:t>
       </w:r>
@@ -343,19 +375,20 @@
         <w:rPr>
           <w:b/>
           <w:color w:val="5F5F5F"/>
-          <w:sz w:val="20"/>
-          <w:szCs w:val="20"/>
+          <w:sz w:val="21"/>
+          <w:szCs w:val="21"/>
         </w:rPr>
         <w:t xml:space="preserve"> 2017 - December 2022</w:t>
       </w:r>
     </w:p>
     <w:p>
       <w:pPr>
+        <w:keepLines/>
         <w:numPr>
           <w:ilvl w:val="0"/>
           <w:numId w:val="1"/>
         </w:numPr>
-        <w:spacing w:after="25" w:line="258" w:lineRule="auto"/>
+        <w:spacing w:after="38" w:line="240" w:lineRule="exact"/>
         <w:rPr>
           <w:sz w:val="20"/>
           <w:szCs w:val="20"/>
@@ -364,19 +397,20 @@
       <w:r>
         <w:rPr>
           <w:color w:val="000000"/>
-          <w:sz w:val="20"/>
-          <w:szCs w:val="20"/>
+          <w:sz w:val="21"/>
+          <w:szCs w:val="21"/>
         </w:rPr>
         <w:t>Founded and operated a D2C eCommerce product, with end-to-end ownership of the digital platform, customer journey, pricing, payments, suppliers, staffing, budget, service, fulfillment, and go-to-market execution.</w:t>
       </w:r>
     </w:p>
     <w:p>
       <w:pPr>
+        <w:keepLines/>
         <w:numPr>
           <w:ilvl w:val="0"/>
           <w:numId w:val="1"/>
         </w:numPr>
-        <w:spacing w:after="25" w:line="258" w:lineRule="auto"/>
+        <w:spacing w:after="38" w:line="240" w:lineRule="exact"/>
         <w:rPr>
           <w:sz w:val="20"/>
           <w:szCs w:val="20"/>
@@ -385,19 +419,20 @@
       <w:r>
         <w:rPr>
           <w:color w:val="000000"/>
-          <w:sz w:val="20"/>
-          <w:szCs w:val="20"/>
+          <w:sz w:val="21"/>
+          <w:szCs w:val="21"/>
         </w:rPr>
         <w:t>Designed and improved user flows across product discovery, checkout, order processing, fulfillment, delivery, returns, customer service, payment processing, and reporting.</w:t>
       </w:r>
     </w:p>
     <w:p>
       <w:pPr>
+        <w:keepLines/>
         <w:numPr>
           <w:ilvl w:val="0"/>
           <w:numId w:val="1"/>
         </w:numPr>
-        <w:spacing w:after="25" w:line="258" w:lineRule="auto"/>
+        <w:spacing w:after="38" w:line="240" w:lineRule="exact"/>
         <w:rPr>
           <w:sz w:val="20"/>
           <w:szCs w:val="20"/>
@@ -406,19 +441,20 @@
       <w:r>
         <w:rPr>
           <w:color w:val="000000"/>
-          <w:sz w:val="20"/>
-          <w:szCs w:val="20"/>
+          <w:sz w:val="21"/>
+          <w:szCs w:val="21"/>
         </w:rPr>
         <w:t>Defined requirements and managed an external development company from UX and delivery through acceptance testing, launch, bug resolution, changes, and new features.</w:t>
       </w:r>
     </w:p>
     <w:p>
       <w:pPr>
+        <w:keepLines/>
         <w:numPr>
           <w:ilvl w:val="0"/>
           <w:numId w:val="1"/>
         </w:numPr>
-        <w:spacing w:after="25" w:line="258" w:lineRule="auto"/>
+        <w:spacing w:after="38" w:line="240" w:lineRule="exact"/>
         <w:rPr>
           <w:sz w:val="20"/>
           <w:szCs w:val="20"/>
@@ -427,8 +463,8 @@
       <w:r>
         <w:rPr>
           <w:color w:val="000000"/>
-          <w:sz w:val="20"/>
-          <w:szCs w:val="20"/>
+          <w:sz w:val="21"/>
+          <w:szCs w:val="21"/>
         </w:rPr>
         <w:t>Used customer feedback, user behavior, sales, service, and operational data to improve the end-to-end experience and prioritize product and workflow improvements.</w:t>
       </w:r>
@@ -436,7 +472,7 @@
     <w:p>
       <w:pPr>
         <w:keepNext/>
-        <w:spacing w:before="29" w:after="9"/>
+        <w:spacing w:before="44" w:after="16" w:line="240" w:lineRule="auto"/>
         <w:rPr>
           <w:sz w:val="20"/>
           <w:szCs w:val="20"/>
@@ -446,8 +482,8 @@
         <w:rPr>
           <w:b/>
           <w:color w:val="1F4E79"/>
-          <w:sz w:val="20"/>
-          <w:szCs w:val="20"/>
+          <w:sz w:val="21"/>
+          <w:szCs w:val="21"/>
         </w:rPr>
         <w:t>HP (HPE)</w:t>
       </w:r>
@@ -455,8 +491,8 @@
         <w:rPr>
           <w:b/>
           <w:color w:val="1E1E1E"/>
-          <w:sz w:val="20"/>
-          <w:szCs w:val="20"/>
+          <w:sz w:val="21"/>
+          <w:szCs w:val="21"/>
         </w:rPr>
         <w:t xml:space="preserve"> | Business </w:t>
       </w:r>
@@ -464,8 +500,8 @@
         <w:rPr>
           <w:b/>
           <w:color w:val="1E1E1E"/>
-          <w:sz w:val="20"/>
-          <w:szCs w:val="20"/>
+          <w:sz w:val="21"/>
+          <w:szCs w:val="21"/>
         </w:rPr>
         <w:t>Analyst</w:t>
       </w:r>
@@ -473,8 +509,8 @@
         <w:rPr>
           <w:b/>
           <w:color w:val="5F5F5F"/>
-          <w:sz w:val="20"/>
-          <w:szCs w:val="20"/>
+          <w:sz w:val="21"/>
+          <w:szCs w:val="21"/>
         </w:rPr>
         <w:t xml:space="preserve"> | January</w:t>
       </w:r>
@@ -482,19 +518,20 @@
         <w:rPr>
           <w:b/>
           <w:color w:val="5F5F5F"/>
-          <w:sz w:val="20"/>
-          <w:szCs w:val="20"/>
+          <w:sz w:val="21"/>
+          <w:szCs w:val="21"/>
         </w:rPr>
         <w:t xml:space="preserve"> 2015 - December 2016</w:t>
       </w:r>
     </w:p>
     <w:p>
       <w:pPr>
+        <w:keepLines/>
         <w:numPr>
           <w:ilvl w:val="0"/>
           <w:numId w:val="1"/>
         </w:numPr>
-        <w:spacing w:after="25" w:line="258" w:lineRule="auto"/>
+        <w:spacing w:after="38" w:line="240" w:lineRule="exact"/>
         <w:rPr>
           <w:sz w:val="20"/>
           <w:szCs w:val="20"/>
@@ -503,19 +540,20 @@
       <w:r>
         <w:rPr>
           <w:color w:val="000000"/>
-          <w:sz w:val="20"/>
-          <w:szCs w:val="20"/>
+          <w:sz w:val="21"/>
+          <w:szCs w:val="21"/>
         </w:rPr>
         <w:t>Gathered business requirements, modeled operational data, and translated complex production inputs into clear workflows, analytical tools, and process improvements for an industrial product line.</w:t>
       </w:r>
     </w:p>
     <w:p>
       <w:pPr>
+        <w:keepLines/>
         <w:numPr>
           <w:ilvl w:val="0"/>
           <w:numId w:val="1"/>
         </w:numPr>
-        <w:spacing w:after="25" w:line="258" w:lineRule="auto"/>
+        <w:spacing w:after="38" w:line="240" w:lineRule="exact"/>
         <w:rPr>
           <w:sz w:val="20"/>
           <w:szCs w:val="20"/>
@@ -524,8 +562,8 @@
       <w:r>
         <w:rPr>
           <w:color w:val="000000"/>
-          <w:sz w:val="20"/>
-          <w:szCs w:val="20"/>
+          <w:sz w:val="21"/>
+          <w:szCs w:val="21"/>
         </w:rPr>
         <w:t>Collaborated across operations, planning, business, and technical stakeholders and built analytical tools and reports supporting data-driven decisions and cost reduction.</w:t>
       </w:r>
@@ -533,7 +571,7 @@
     <w:p>
       <w:pPr>
         <w:keepNext/>
-        <w:spacing w:before="29" w:after="9"/>
+        <w:spacing w:before="44" w:after="16" w:line="240" w:lineRule="auto"/>
         <w:rPr>
           <w:sz w:val="20"/>
           <w:szCs w:val="20"/>
@@ -543,8 +581,8 @@
         <w:rPr>
           <w:b/>
           <w:color w:val="1F4E79"/>
-          <w:sz w:val="20"/>
-          <w:szCs w:val="20"/>
+          <w:sz w:val="21"/>
+          <w:szCs w:val="21"/>
         </w:rPr>
         <w:t>HP (HPE)</w:t>
       </w:r>
@@ -552,8 +590,8 @@
         <w:rPr>
           <w:b/>
           <w:color w:val="1E1E1E"/>
-          <w:sz w:val="20"/>
-          <w:szCs w:val="20"/>
+          <w:sz w:val="21"/>
+          <w:szCs w:val="21"/>
         </w:rPr>
         <w:t xml:space="preserve"> | Material Planner </w:t>
       </w:r>
@@ -561,8 +599,8 @@
         <w:rPr>
           <w:b/>
           <w:color w:val="1E1E1E"/>
-          <w:sz w:val="20"/>
-          <w:szCs w:val="20"/>
+          <w:sz w:val="21"/>
+          <w:szCs w:val="21"/>
         </w:rPr>
         <w:t>Analyst</w:t>
       </w:r>
@@ -570,8 +608,8 @@
         <w:rPr>
           <w:b/>
           <w:color w:val="5F5F5F"/>
-          <w:sz w:val="20"/>
-          <w:szCs w:val="20"/>
+          <w:sz w:val="21"/>
+          <w:szCs w:val="21"/>
         </w:rPr>
         <w:t xml:space="preserve"> | January</w:t>
       </w:r>
@@ -579,19 +617,20 @@
         <w:rPr>
           <w:b/>
           <w:color w:val="5F5F5F"/>
-          <w:sz w:val="20"/>
-          <w:szCs w:val="20"/>
+          <w:sz w:val="21"/>
+          <w:szCs w:val="21"/>
         </w:rPr>
         <w:t xml:space="preserve"> 2013 - December 2014</w:t>
       </w:r>
     </w:p>
     <w:p>
       <w:pPr>
+        <w:keepLines/>
         <w:numPr>
           <w:ilvl w:val="0"/>
           <w:numId w:val="1"/>
         </w:numPr>
-        <w:spacing w:after="25" w:line="258" w:lineRule="auto"/>
+        <w:spacing w:after="38" w:line="240" w:lineRule="exact"/>
         <w:rPr>
           <w:sz w:val="20"/>
           <w:szCs w:val="20"/>
@@ -600,8 +639,8 @@
       <w:r>
         <w:rPr>
           <w:color w:val="000000"/>
-          <w:sz w:val="20"/>
-          <w:szCs w:val="20"/>
+          <w:sz w:val="21"/>
+          <w:szCs w:val="21"/>
         </w:rPr>
         <w:t>Managed supply-chain planning across six operational divisions, including inventory monitoring, supplier coordination, exception handling, and VMI oversight; wrote work manuals and trained four logistics specialists.</w:t>
       </w:r>
@@ -609,7 +648,7 @@
     <w:p>
       <w:pPr>
         <w:keepNext/>
-        <w:spacing w:before="29" w:after="9"/>
+        <w:spacing w:before="44" w:after="16" w:line="240" w:lineRule="auto"/>
         <w:rPr>
           <w:sz w:val="20"/>
           <w:szCs w:val="20"/>
@@ -619,8 +658,8 @@
         <w:rPr>
           <w:b/>
           <w:color w:val="1F4E79"/>
-          <w:sz w:val="20"/>
-          <w:szCs w:val="20"/>
+          <w:sz w:val="21"/>
+          <w:szCs w:val="21"/>
         </w:rPr>
         <w:t>SAP WIN</w:t>
       </w:r>
@@ -628,8 +667,8 @@
         <w:rPr>
           <w:b/>
           <w:color w:val="1E1E1E"/>
-          <w:sz w:val="20"/>
-          <w:szCs w:val="20"/>
+          <w:sz w:val="21"/>
+          <w:szCs w:val="21"/>
         </w:rPr>
         <w:t xml:space="preserve"> | Project </w:t>
       </w:r>
@@ -637,8 +676,8 @@
         <w:rPr>
           <w:b/>
           <w:color w:val="1E1E1E"/>
-          <w:sz w:val="20"/>
-          <w:szCs w:val="20"/>
+          <w:sz w:val="21"/>
+          <w:szCs w:val="21"/>
         </w:rPr>
         <w:t>Manager</w:t>
       </w:r>
@@ -646,8 +685,8 @@
         <w:rPr>
           <w:b/>
           <w:color w:val="5F5F5F"/>
-          <w:sz w:val="20"/>
-          <w:szCs w:val="20"/>
+          <w:sz w:val="21"/>
+          <w:szCs w:val="21"/>
         </w:rPr>
         <w:t xml:space="preserve"> | February</w:t>
       </w:r>
@@ -655,19 +694,20 @@
         <w:rPr>
           <w:b/>
           <w:color w:val="5F5F5F"/>
-          <w:sz w:val="20"/>
-          <w:szCs w:val="20"/>
+          <w:sz w:val="21"/>
+          <w:szCs w:val="21"/>
         </w:rPr>
         <w:t xml:space="preserve"> 2012 - January 2013</w:t>
       </w:r>
     </w:p>
     <w:p>
       <w:pPr>
+        <w:keepLines/>
         <w:numPr>
           <w:ilvl w:val="0"/>
           <w:numId w:val="1"/>
         </w:numPr>
-        <w:spacing w:after="25" w:line="258" w:lineRule="auto"/>
+        <w:spacing w:after="38" w:line="240" w:lineRule="exact"/>
         <w:rPr>
           <w:sz w:val="20"/>
           <w:szCs w:val="20"/>
@@ -676,8 +716,8 @@
       <w:r>
         <w:rPr>
           <w:color w:val="000000"/>
-          <w:sz w:val="20"/>
-          <w:szCs w:val="20"/>
+          <w:sz w:val="21"/>
+          <w:szCs w:val="21"/>
         </w:rPr>
         <w:t>Managed a year-long, on-site SAP R/3 implementation across Production and Accounting modules, leading requirements, work planning, developer-user coordination, testing, training, Go-Live, and post-launch support.</w:t>
       </w:r>
@@ -688,7 +728,7 @@
         <w:pBdr>
           <w:bottom w:val="single" w:sz="6" w:space="1" w:color="1F4E79"/>
         </w:pBdr>
-        <w:spacing w:before="49" w:after="31"/>
+        <w:spacing w:before="64" w:after="40" w:line="240" w:lineRule="auto"/>
         <w:rPr>
           <w:sz w:val="20"/>
           <w:szCs w:val="20"/>
@@ -698,15 +738,15 @@
         <w:rPr>
           <w:b/>
           <w:color w:val="1F4E79"/>
-          <w:sz w:val="20"/>
-          <w:szCs w:val="20"/>
+          <w:sz w:val="22"/>
+          <w:szCs w:val="22"/>
         </w:rPr>
         <w:t>EDUCATION</w:t>
       </w:r>
     </w:p>
     <w:p>
       <w:pPr>
-        <w:spacing w:after="16"/>
+        <w:spacing w:after="16" w:line="240" w:lineRule="auto"/>
         <w:rPr>
           <w:sz w:val="20"/>
           <w:szCs w:val="20"/>
@@ -715,15 +755,15 @@
       <w:r>
         <w:rPr>
           <w:color w:val="000000"/>
-          <w:sz w:val="20"/>
-          <w:szCs w:val="20"/>
+          <w:sz w:val="21"/>
+          <w:szCs w:val="21"/>
         </w:rPr>
         <w:t>Ben-Gurion University of the Negev | B.Sc. in Industrial Engineering &amp; Management | 2008 - 2012</w:t>
       </w:r>
     </w:p>
     <w:p>
       <w:pPr>
-        <w:spacing w:after="18"/>
+        <w:spacing w:after="16" w:line="240" w:lineRule="auto"/>
         <w:rPr>
           <w:sz w:val="20"/>
           <w:szCs w:val="20"/>
@@ -732,8 +772,8 @@
       <w:r>
         <w:rPr>
           <w:color w:val="000000"/>
-          <w:sz w:val="20"/>
-          <w:szCs w:val="20"/>
+          <w:sz w:val="21"/>
+          <w:szCs w:val="21"/>
         </w:rPr>
         <w:t>Coding Academy Israel | Full-Stack &amp; Frontend Development | July - November 2022</w:t>
       </w:r>
@@ -744,7 +784,7 @@
         <w:pBdr>
           <w:bottom w:val="single" w:sz="6" w:space="1" w:color="1F4E79"/>
         </w:pBdr>
-        <w:spacing w:before="49" w:after="31"/>
+        <w:spacing w:before="64" w:after="40" w:line="240" w:lineRule="auto"/>
         <w:rPr>
           <w:sz w:val="20"/>
           <w:szCs w:val="20"/>
@@ -754,15 +794,15 @@
         <w:rPr>
           <w:b/>
           <w:color w:val="1F4E79"/>
-          <w:sz w:val="20"/>
-          <w:szCs w:val="20"/>
+          <w:sz w:val="22"/>
+          <w:szCs w:val="22"/>
         </w:rPr>
         <w:t>SKILLS &amp; TOOLS</w:t>
       </w:r>
     </w:p>
     <w:p>
       <w:pPr>
-        <w:spacing w:after="7" w:line="250" w:lineRule="auto"/>
+        <w:spacing w:after="18" w:line="228" w:lineRule="exact"/>
         <w:rPr>
           <w:sz w:val="20"/>
           <w:szCs w:val="20"/>
@@ -772,15 +812,15 @@
         <w:rPr>
           <w:b/>
           <w:color w:val="1F4E79"/>
-          <w:sz w:val="20"/>
-          <w:szCs w:val="20"/>
+          <w:sz w:val="21"/>
+          <w:szCs w:val="21"/>
         </w:rPr>
         <w:t>B2B2C Product: Strategy, discovery, roadmaps, specifications, interactive web and mobile UX, user flows, launch and iteration</w:t>
       </w:r>
     </w:p>
     <w:p>
       <w:pPr>
-        <w:spacing w:after="7" w:line="250" w:lineRule="auto"/>
+        <w:spacing w:after="18" w:line="228" w:lineRule="exact"/>
         <w:rPr>
           <w:sz w:val="20"/>
           <w:szCs w:val="20"/>
@@ -790,22 +830,22 @@
         <w:rPr>
           <w:b/>
           <w:color w:val="1F4E79"/>
-          <w:sz w:val="20"/>
-          <w:szCs w:val="20"/>
+          <w:sz w:val="21"/>
+          <w:szCs w:val="21"/>
         </w:rPr>
         <w:t>Data &amp; Technical: GA4, Firebase, APIs, integrations, business rules, acceptance criteria, Jira, Figma</w:t>
       </w:r>
     </w:p>
     <w:p>
       <w:pPr>
-        <w:spacing w:after="7" w:line="250" w:lineRule="auto"/>
+        <w:spacing w:after="18" w:line="228" w:lineRule="exact"/>
       </w:pPr>
       <w:r>
         <w:rPr>
           <w:b/>
           <w:color w:val="1F4E79"/>
-          <w:sz w:val="20"/>
-          <w:szCs w:val="20"/>
+          <w:sz w:val="21"/>
+          <w:szCs w:val="21"/>
         </w:rPr>
         <w:t>Execution, AI &amp; Languages: Global-market coordination, Cursor, Claude, ChatGPT, Codex, stakeholder/vendor alignment | Hebrew: Native; English: Fluent</w:t>
       </w:r>

</xml_diff>